<commit_message>
Address confirmation letter to the actual sender/recipient, mark it a follow-up
Doheon shared the original standard-BoM request email he'd sent Anycomm
(양희진 부장 / hjyang@anycomm.net, cc 조상연, from 이돈현 in KT commerce's
네트워크사업1팀). Updated the letter's info block to name the real sender
and recipient instead of generic placeholders, reworded the background
paragraph to reference that earlier request explicitly ("후속" follow-up),
and filled in the 문의처 section with his name and team (phone left as a
bracket for him to add).

Co-Authored-By: Claude Sonnet 5 <noreply@anthropic.com>
Claude-Session: https://claude.ai/code/session_01AryUgRjpSQqgBukEnG9knM
</commit_message>
<xml_diff>
--- a/output/Aviat_확인요청서.docx
+++ b/output/Aviat_확인요청서.docx
@@ -76,7 +76,7 @@
                 <w:sz w:val="20"/>
                 <w:szCs w:val="20"/>
               </w:rPr>
-              <w:t xml:space="preserve">애니콤(Aviat Networks 한국 총판) 담당자</w:t>
+              <w:t xml:space="preserve">애니콤 양희진 부장님</w:t>
             </w:r>
           </w:p>
         </w:tc>
@@ -102,7 +102,7 @@
                 <w:sz w:val="20"/>
                 <w:szCs w:val="20"/>
               </w:rPr>
-              <w:t xml:space="preserve">발신</w:t>
+              <w:t xml:space="preserve">참조</w:t>
             </w:r>
           </w:p>
         </w:tc>
@@ -123,7 +123,7 @@
                 <w:sz w:val="20"/>
                 <w:szCs w:val="20"/>
               </w:rPr>
-              <w:t xml:space="preserve">KT commerce</w:t>
+              <w:t xml:space="preserve">조상연(KT commerce 네트워크사업1팀)</w:t>
             </w:r>
           </w:p>
         </w:tc>
@@ -149,7 +149,7 @@
                 <w:sz w:val="20"/>
                 <w:szCs w:val="20"/>
               </w:rPr>
-              <w:t xml:space="preserve">일자</w:t>
+              <w:t xml:space="preserve">발신</w:t>
             </w:r>
           </w:p>
         </w:tc>
@@ -170,7 +170,7 @@
                 <w:sz w:val="20"/>
                 <w:szCs w:val="20"/>
               </w:rPr>
-              <w:t xml:space="preserve">2026-09-04</w:t>
+              <w:t xml:space="preserve">KT commerce 네트워크사업1팀 이돈현</w:t>
             </w:r>
           </w:p>
         </w:tc>
@@ -196,7 +196,7 @@
                 <w:sz w:val="20"/>
                 <w:szCs w:val="20"/>
               </w:rPr>
-              <w:t xml:space="preserve">제목</w:t>
+              <w:t xml:space="preserve">일자</w:t>
             </w:r>
           </w:p>
         </w:tc>
@@ -217,7 +217,54 @@
                 <w:sz w:val="20"/>
                 <w:szCs w:val="20"/>
               </w:rPr>
-              <w:t xml:space="preserve">Aviat HAX/VR4/VR10 계열 8GHz·11GHz 대역 구성별 표준 BoM 확인 요청</w:t>
+              <w:t xml:space="preserve">2026-09-08</w:t>
+            </w:r>
+          </w:p>
+        </w:tc>
+      </w:tr>
+      <w:tr>
+        <w:tc>
+          <w:tcPr>
+            <w:tcW w:type="dxa" w:w="1800"/>
+            <w:tcBorders>
+              <w:top w:val="none" w:color="FFFFFF" w:sz="0"/>
+              <w:left w:val="none" w:color="FFFFFF" w:sz="0"/>
+              <w:bottom w:val="none" w:color="FFFFFF" w:sz="0"/>
+              <w:right w:val="none" w:color="FFFFFF" w:sz="0"/>
+            </w:tcBorders>
+            <w:shd w:fill="F2F2F2" w:val="clear"/>
+          </w:tcPr>
+          <w:p>
+            <w:r>
+              <w:rPr>
+                <w:rFonts w:ascii="맑은 고딕" w:cs="맑은 고딕" w:eastAsia="맑은 고딕" w:hAnsi="맑은 고딕"/>
+                <w:b/>
+                <w:bCs/>
+                <w:sz w:val="20"/>
+                <w:szCs w:val="20"/>
+              </w:rPr>
+              <w:t xml:space="preserve">제목</w:t>
+            </w:r>
+          </w:p>
+        </w:tc>
+        <w:tc>
+          <w:tcPr>
+            <w:tcW w:type="dxa" w:w="7200"/>
+            <w:tcBorders>
+              <w:top w:val="none" w:color="FFFFFF" w:sz="0"/>
+              <w:left w:val="none" w:color="FFFFFF" w:sz="0"/>
+              <w:bottom w:val="none" w:color="FFFFFF" w:sz="0"/>
+              <w:right w:val="none" w:color="FFFFFF" w:sz="0"/>
+            </w:tcBorders>
+          </w:tcPr>
+          <w:p>
+            <w:r>
+              <w:rPr>
+                <w:rFonts w:ascii="맑은 고딕" w:cs="맑은 고딕" w:eastAsia="맑은 고딕" w:hAnsi="맑은 고딕"/>
+                <w:sz w:val="20"/>
+                <w:szCs w:val="20"/>
+              </w:rPr>
+              <w:t xml:space="preserve">Aviat HAX/VR4/VR10 계열 8GHz·11GHz 대역 구성별 표준 BoM 확인 요청(후속)</w:t>
             </w:r>
           </w:p>
         </w:tc>
@@ -264,7 +311,7 @@
           <w:sz w:val="22"/>
           <w:szCs w:val="22"/>
         </w:rPr>
-        <w:t xml:space="preserve">KT commerce는 최근 발주이력을 자체 분석하여 Aviat 계열 마이크로웨이브 장비의 8GHz·11GHz 대역 2+0/4+0 구성 후보 BoM을 추정하였습니다. 이는 발주이력에 근거한 추정치로, 공식 표준 BoM으로 확정하기 위해서는 귀사의 확인이 필요합니다. 아래 항목을 우선적으로 확인 부탁드리며, 전체 213개 계약품목에 대한 표준 BoM 양식 회신도 함께 요청드립니다.</w:t>
+        <w:t xml:space="preserve">앞서 요청드린 'Aviat MDM 구성방식별 표준 BoM 작성' 건과 관련하여, KT commerce는 그 동안의 발주이력을 자체 분석하여 Aviat 계열 마이크로웨이브 장비의 8GHz·11GHz 대역 2+0/4+0 구성 후보 BoM을 우선 도출하였습니다. 이는 발주이력에 근거한 추정치로, 공식 표준 BoM으로 확정하기 위해서는 귀사의 확인이 필요합니다. 아래 항목을 우선적으로 확인 부탁드리며, 전체 213개 계약품목에 대한 표준 BoM 양식 회신도 함께 요청드립니다.</w:t>
       </w:r>
     </w:p>
     <w:p>
@@ -809,7 +856,7 @@
           <w:sz w:val="22"/>
           <w:szCs w:val="22"/>
         </w:rPr>
-        <w:t xml:space="preserve">[담당자명 / 연락처 / 이메일 기재]</w:t>
+        <w:t xml:space="preserve">KT commerce 네트워크사업1팀 이돈현 (본 메일로 회신 부탁드립니다. 연락처: [기재])</w:t>
       </w:r>
     </w:p>
     <w:sectPr>

</xml_diff>

<commit_message>
Add a reply deadline to the confirmation letter
Doheon has a contract deadline forcing unit-price agreement with both
Anycomm (Aviat) and 대성 (Ceragon) - he can't wait indefinitely on
Aviat's reply. Added a dated deadline line to section 3 with a request
to flag in advance if it can't be met, so Aviat has a concrete reason
to prioritize this over a generic "no timeline" ask.

Co-Authored-By: Claude Sonnet 5 <noreply@anthropic.com>
Claude-Session: https://claude.ai/code/session_01AryUgRjpSQqgBukEnG9knM
</commit_message>
<xml_diff>
--- a/output/Aviat_확인요청서.docx
+++ b/output/Aviat_확인요청서.docx
@@ -799,7 +799,7 @@
           <w:b/>
           <w:bCs/>
         </w:rPr>
-        <w:t xml:space="preserve">3. 회신 방법</w:t>
+        <w:t xml:space="preserve">3. 회신 방법 및 기한</w:t>
       </w:r>
     </w:p>
     <w:p>
@@ -828,6 +828,20 @@
           <w:szCs w:val="20"/>
         </w:rPr>
         <w:t xml:space="preserve">- 위 [1]~[6] 항목은 특히 우선적으로 확인 부탁드리며, 전체 213개 계약품목에 대한 회신도 함께 요청드립니다.</w:t>
+      </w:r>
+    </w:p>
+    <w:p>
+      <w:pPr>
+        <w:spacing w:after="100"/>
+        <w:ind w:left="360"/>
+      </w:pPr>
+      <w:r>
+        <w:rPr>
+          <w:rFonts w:ascii="맑은 고딕" w:cs="맑은 고딕" w:eastAsia="맑은 고딕" w:hAnsi="맑은 고딕"/>
+          <w:sz w:val="20"/>
+          <w:szCs w:val="20"/>
+        </w:rPr>
+        <w:t xml:space="preserve">- 저희 쪽 단가 협의 및 계약 일정상 [YYYY-MM-DD]까지 회신 부탁드립니다. 해당 일정 내 회신이 어려우신 경우, 그 사유와 가능한 회신 일정을 사전에 알려주시면 감사하겠습니다.</w:t>
       </w:r>
     </w:p>
     <w:p>

</xml_diff>